<commit_message>
Access matrix of every BRD pack from the permissions, group profiles, menus and server checks
New pack_access builder (document key ACX) wired into build_pack.py and the
Remittance and Claims pack builder: group profile x screen x action with the
permission each action asks for, the group profiles, the menu of each
persona and the service operations of the pack. Issued as
BIBS_Access_BRD-xx_..._Access_Matrix_v1.0.xlsx in the six packs and listed
in each How to Read note and in the Document Register. The Remittance and
Claims developer specifications now include the settings, claim handling
and checklist services.
</commit_message>
<xml_diff>
--- a/docs/deliverables/out/Programme/BDOI_Template_FRS/BRD-02_Operations_Cashiering/BIBS_Inputs_BRD-02_How_to_Read_this_Pack_v1.0.docx
+++ b/docs/deliverables/out/Programme/BDOI_Template_FRS/BRD-02_Operations_Cashiering/BIBS_Inputs_BRD-02_How_to_Read_this_Pack_v1.0.docx
@@ -3090,11 +3090,126 @@
           </w:p>
         </w:tc>
       </w:tr>
+      <w:tr>
+        <w:trPr>
+          <w:cantSplit/>
+        </w:trPr>
+        <w:tc>
+          <w:tcPr>
+            <w:tcW w:type="dxa" w:w="459"/>
+          </w:tcPr>
+          <w:p>
+            <w:pPr>
+              <w:spacing w:before="20" w:after="20"/>
+            </w:pPr>
+            <w:r>
+              <w:rPr>
+                <w:rFonts w:ascii="Arial" w:hAnsi="Arial" w:cs="Arial" w:eastAsia="Arial"/>
+                <w:b w:val="0"/>
+                <w:i w:val="0"/>
+                <w:sz w:val="18"/>
+              </w:rPr>
+              <w:t>15</w:t>
+            </w:r>
+          </w:p>
+        </w:tc>
+        <w:tc>
+          <w:tcPr>
+            <w:tcW w:type="dxa" w:w="2573"/>
+          </w:tcPr>
+          <w:p>
+            <w:pPr>
+              <w:spacing w:before="20" w:after="20"/>
+            </w:pPr>
+            <w:r>
+              <w:rPr>
+                <w:rFonts w:ascii="Arial" w:hAnsi="Arial" w:cs="Arial" w:eastAsia="Arial"/>
+                <w:b w:val="0"/>
+                <w:i w:val="0"/>
+                <w:sz w:val="18"/>
+              </w:rPr>
+              <w:t>Access BRD-02 Cashiering Access Matrix</w:t>
+            </w:r>
+          </w:p>
+        </w:tc>
+        <w:tc>
+          <w:tcPr>
+            <w:tcW w:type="dxa" w:w="643"/>
+          </w:tcPr>
+          <w:p>
+            <w:pPr>
+              <w:spacing w:before="20" w:after="20"/>
+            </w:pPr>
+            <w:r>
+              <w:rPr>
+                <w:rFonts w:ascii="Arial" w:hAnsi="Arial" w:cs="Arial" w:eastAsia="Arial"/>
+                <w:b w:val="0"/>
+                <w:i w:val="0"/>
+                <w:sz w:val="18"/>
+              </w:rPr>
+              <w:t>1.0</w:t>
+            </w:r>
+          </w:p>
+        </w:tc>
+        <w:tc>
+          <w:tcPr>
+            <w:tcW w:type="dxa" w:w="3125"/>
+          </w:tcPr>
+          <w:p>
+            <w:pPr>
+              <w:spacing w:before="20" w:after="20"/>
+            </w:pPr>
+            <w:r>
+              <w:rPr>
+                <w:rFonts w:ascii="Arial" w:hAnsi="Arial" w:cs="Arial" w:eastAsia="Arial"/>
+                <w:b w:val="0"/>
+                <w:i w:val="0"/>
+                <w:sz w:val="18"/>
+              </w:rPr>
+              <w:t>Group profile x screen x action, from the permissions, group profiles, menus and server checks of the release.</w:t>
+            </w:r>
+          </w:p>
+        </w:tc>
+        <w:tc>
+          <w:tcPr>
+            <w:tcW w:type="dxa" w:w="1838"/>
+          </w:tcPr>
+          <w:p>
+            <w:pPr>
+              <w:spacing w:before="20" w:after="20"/>
+            </w:pPr>
+            <w:r>
+              <w:rPr>
+                <w:rFonts w:ascii="Arial" w:hAnsi="Arial" w:cs="Arial" w:eastAsia="Arial"/>
+                <w:b w:val="0"/>
+                <w:i w:val="0"/>
+                <w:sz w:val="18"/>
+              </w:rPr>
+              <w:t>BDOI Information Security; UAT lead</w:t>
+            </w:r>
+          </w:p>
+        </w:tc>
+      </w:tr>
     </w:tbl>
     <w:p>
       <w:pPr>
         <w:spacing w:after="40"/>
       </w:pPr>
+    </w:p>
+    <w:p>
+      <w:pPr>
+        <w:spacing w:after="120"/>
+        <w:ind w:left="363"/>
+      </w:pPr>
+      <w:r>
+        <w:rPr>
+          <w:rFonts w:ascii="Arial" w:hAnsi="Arial" w:cs="Arial" w:eastAsia="Arial"/>
+          <w:b w:val="0"/>
+          <w:i w:val="0"/>
+          <w:sz w:val="20"/>
+        </w:rPr>
+        <w:t>The Access Matrix (BIBS_Access_BRD-02_Cashiering_Access_Matrix_v1.0.xlsx) shows, for each group profile assigned in UIDM-ISC, the screens of the pack it opens and the actions it may do on each screen, with the permission the server checks. It is written from the permissions, group profiles, menus and server checks of the release, so it shows the access as delivered; Information Security and the UAT lead review it against the persona tables of the FRS.</w:t>
+      </w:r>
     </w:p>
     <w:p>
       <w:pPr>

</xml_diff>

<commit_message>
System Requirements Specification v1.2 with one chapter per BRD, SRS extracts and traceability matrix v1.2
The SRS is restructured into the common requirements and one chapter per
BRD; each system requirement is tagged with its BRD and traced to its FRS
(in BDOI's format for BRD-02, BRD-03, BRD-06, BRD-07 and BRD-11) and the
document reflects the deliveries and client decisions to 17-Oct-2026. A
5 to 10 page extract of each chapter is issued into the six packs and
listed in their How to Read notes. The traceability matrix v1.2 adds the
System requirements sheet. The Conformance Register v1.7 leaves out the
Remittance requirement specified in other FRS and uses Product Maintenance
FRS v1.7. Decision Log O-024; document register and indexes refreshed.
</commit_message>
<xml_diff>
--- a/docs/deliverables/out/Programme/BDOI_Template_FRS/BRD-02_Operations_Cashiering/BIBS_Inputs_BRD-02_How_to_Read_this_Pack_v1.0.docx
+++ b/docs/deliverables/out/Programme/BDOI_Template_FRS/BRD-02_Operations_Cashiering/BIBS_Inputs_BRD-02_How_to_Read_this_Pack_v1.0.docx
@@ -3186,6 +3186,106 @@
                 <w:sz w:val="18"/>
               </w:rPr>
               <w:t>BDOI Information Security; UAT lead</w:t>
+            </w:r>
+          </w:p>
+        </w:tc>
+      </w:tr>
+      <w:tr>
+        <w:trPr>
+          <w:cantSplit/>
+        </w:trPr>
+        <w:tc>
+          <w:tcPr>
+            <w:tcW w:type="dxa" w:w="459"/>
+          </w:tcPr>
+          <w:p>
+            <w:pPr>
+              <w:spacing w:before="20" w:after="20"/>
+            </w:pPr>
+            <w:r>
+              <w:rPr>
+                <w:rFonts w:ascii="Arial" w:hAnsi="Arial" w:cs="Arial" w:eastAsia="Arial"/>
+                <w:b w:val="0"/>
+                <w:i w:val="0"/>
+                <w:sz w:val="18"/>
+              </w:rPr>
+              <w:t>16</w:t>
+            </w:r>
+          </w:p>
+        </w:tc>
+        <w:tc>
+          <w:tcPr>
+            <w:tcW w:type="dxa" w:w="2573"/>
+          </w:tcPr>
+          <w:p>
+            <w:pPr>
+              <w:spacing w:before="20" w:after="20"/>
+            </w:pPr>
+            <w:r>
+              <w:rPr>
+                <w:rFonts w:ascii="Arial" w:hAnsi="Arial" w:cs="Arial" w:eastAsia="Arial"/>
+                <w:b w:val="0"/>
+                <w:i w:val="0"/>
+                <w:sz w:val="18"/>
+              </w:rPr>
+              <w:t>SRS BRD-02 Cashiering System Requirements Extract</w:t>
+            </w:r>
+          </w:p>
+        </w:tc>
+        <w:tc>
+          <w:tcPr>
+            <w:tcW w:type="dxa" w:w="643"/>
+          </w:tcPr>
+          <w:p>
+            <w:pPr>
+              <w:spacing w:before="20" w:after="20"/>
+            </w:pPr>
+            <w:r>
+              <w:rPr>
+                <w:rFonts w:ascii="Arial" w:hAnsi="Arial" w:cs="Arial" w:eastAsia="Arial"/>
+                <w:b w:val="0"/>
+                <w:i w:val="0"/>
+                <w:sz w:val="18"/>
+              </w:rPr>
+              <w:t>1.2</w:t>
+            </w:r>
+          </w:p>
+        </w:tc>
+        <w:tc>
+          <w:tcPr>
+            <w:tcW w:type="dxa" w:w="3125"/>
+          </w:tcPr>
+          <w:p>
+            <w:pPr>
+              <w:spacing w:before="20" w:after="20"/>
+            </w:pPr>
+            <w:r>
+              <w:rPr>
+                <w:rFonts w:ascii="Arial" w:hAnsi="Arial" w:cs="Arial" w:eastAsia="Arial"/>
+                <w:b w:val="0"/>
+                <w:i w:val="0"/>
+                <w:sz w:val="18"/>
+              </w:rPr>
+              <w:t>The chapter of the BIBS System Requirements Specification v1.2 for this module: system requirements traced to the FRS, common requirements, access and acceptance.</w:t>
+            </w:r>
+          </w:p>
+        </w:tc>
+        <w:tc>
+          <w:tcPr>
+            <w:tcW w:type="dxa" w:w="1838"/>
+          </w:tcPr>
+          <w:p>
+            <w:pPr>
+              <w:spacing w:before="20" w:after="20"/>
+            </w:pPr>
+            <w:r>
+              <w:rPr>
+                <w:rFonts w:ascii="Arial" w:hAnsi="Arial" w:cs="Arial" w:eastAsia="Arial"/>
+                <w:b w:val="0"/>
+                <w:i w:val="0"/>
+                <w:sz w:val="18"/>
+              </w:rPr>
+              <w:t>BDOI Product Owner; BDOI IT</w:t>
             </w:r>
           </w:p>
         </w:tc>

</xml_diff>